<commit_message>
Revert opening to original structure with selective feedback fixes
- Kept original professional tone and paragraph structure
- Changed 'provides' to 'offers' and 'supports' where natural
- Changed 'organizations still need' to 'you still need' (second person)
- Added concrete outcome in 'In this post' paragraph
- Kept hyperlinks on first mentions
</commit_message>
<xml_diff>
--- a/Real-time CDC from Amazon Aurora PostgreSQL to Apache Iceberg tables in Amazon S3 Tables.docx
+++ b/Real-time CDC from Amazon Aurora PostgreSQL to Apache Iceberg tables in Amazon S3 Tables.docx
@@ -27,7 +27,7 @@
           <w:i w:val="0"/>
           <w:sz w:val="21"/>
         </w:rPr>
-        <w:t xml:space="preserve">Organizations running transactional workloads on </w:t>
+        <w:t xml:space="preserve">If you run transactional workloads on </w:t>
       </w:r>
       <w:hyperlink r:id="rId9">
         <w:r>
@@ -48,7 +48,7 @@
           <w:i w:val="0"/>
           <w:sz w:val="21"/>
         </w:rPr>
-        <w:t xml:space="preserve"> (Aurora PostgreSQL) often need to make operational data available for analytics without impacting production performance. This becomes especially challenging when data is distributed across multiple Aurora clusters, making it difficult to join datasets and build cross-domain analytics workflows.</w:t>
+        <w:t xml:space="preserve"> (Aurora PostgreSQL) you likely need to make that operational data available for analytics without slowing down production queries. This gets harder when your data is spread across multiple Aurora clusters, because joining datasets and building cross-domain analytics workflows requires moving data out of those isolated databases.</w:t>
       </w:r>
     </w:p>
     <w:p>
@@ -125,7 +125,7 @@
           <w:i w:val="0"/>
           <w:sz w:val="21"/>
         </w:rPr>
-        <w:t xml:space="preserve"> (Amazon S3), provides purpose-built storage for Apache Iceberg tables with automatic snapshot management and compaction, making it a foundation for a governed lakehouse architecture.</w:t>
+        <w:t xml:space="preserve"> (Amazon S3), stores Apache Iceberg tables with automatic snapshot management and compaction, so you can focus on analytics instead of table maintenance.</w:t>
       </w:r>
     </w:p>
     <w:p>
@@ -139,7 +139,7 @@
           <w:i w:val="0"/>
           <w:sz w:val="21"/>
         </w:rPr>
-        <w:t>However, organizations still need a reliable way to continuously ingest operational database changes into the lakehouse while preserving transactional performance.</w:t>
+        <w:t>The missing piece is a reliable way to continuously stream your database changes into the lakehouse without affecting transactional performance.</w:t>
       </w:r>
     </w:p>
     <w:p>
@@ -174,7 +174,7 @@
           <w:i w:val="0"/>
           <w:sz w:val="21"/>
         </w:rPr>
-        <w:t xml:space="preserve"> (AWS CDK). This architecture enables scalable analytics and lakehouse adoption while keeping transactional workloads isolated from analytics processing.</w:t>
+        <w:t xml:space="preserve"> (AWS CDK). By the end, you have a working pipeline that captures inserts, updates, and deletes from Aurora and applies them as row-level Iceberg operations in S3 Tables.</w:t>
       </w:r>
     </w:p>
     <w:p>
@@ -967,7 +967,7 @@
           <w:i w:val="0"/>
           <w:sz w:val="21"/>
         </w:rPr>
-        <w:t xml:space="preserve"> (these are treated as hints, and Firehose may choose different values when optimal) and writes them as Parquet data files. S3 Tables automatically handles Iceberg snapshot management and </w:t>
+        <w:t xml:space="preserve"> (these are treated as hints, and Firehose may choose different values when optimal) and writes them as Parquet data files. S3 Tables handles Iceberg snapshot management and </w:t>
       </w:r>
       <w:hyperlink r:id="rId27">
         <w:r>
@@ -1023,7 +1023,7 @@
           <w:i w:val="0"/>
           <w:sz w:val="21"/>
         </w:rPr>
-        <w:t xml:space="preserve"> provides centralized access control for the Iceberg tables, and downstream services such as </w:t>
+        <w:t xml:space="preserve"> for access control, and you can query the Iceberg tables with downstream services such as </w:t>
       </w:r>
       <w:hyperlink r:id="rId29">
         <w:r>
@@ -6202,7 +6202,7 @@
           <w:color w:val="1A1A1A"/>
           <w:sz w:val="17"/>
         </w:rPr>
-        <w:t># Grant table-level permissions (wildcard for all tables in the namespace)</w:t>
+        <w:t># Grant table-level permissions (wildcard for the tables in the namespace)</w:t>
       </w:r>
     </w:p>
     <w:p>
@@ -7842,7 +7842,7 @@
           <w:i w:val="0"/>
           <w:sz w:val="21"/>
         </w:rPr>
-        <w:t xml:space="preserve"> routes CDC events from all tables into a single topic (</w:t>
+        <w:t xml:space="preserve"> routes CDC events from the monitored tables into a single topic (</w:t>
       </w:r>
       <w:r>
         <w:rPr>
@@ -8180,7 +8180,7 @@
           <w:i w:val="0"/>
           <w:sz w:val="21"/>
         </w:rPr>
-        <w:t xml:space="preserve">If the tables were empty when the connector started, the export count is 0. If you had existing data, the snapshot captures all existing rows as </w:t>
+        <w:t xml:space="preserve">If the tables were empty when the connector started, the export count is 0. If you had existing data, the snapshot captures the existing rows as </w:t>
       </w:r>
       <w:r>
         <w:rPr>
@@ -9617,7 +9617,7 @@
           <w:i w:val="0"/>
           <w:sz w:val="21"/>
         </w:rPr>
-        <w:t>This confirms that the pipeline correctly handles all three CDC operation types: inserts, updates, and deletes are captured from the Aurora WAL by Debezium, routed through the single MSK topic, transformed by the Lambda function, and applied as row-level Iceberg operations by Firehose.</w:t>
+        <w:t>This confirms that the pipeline correctly handles the three CDC operation types: inserts, updates, and deletes are captured from the Aurora WAL by Debezium, routed through the single MSK topic, transformed by the Lambda function, and applied as row-level Iceberg operations by Firehose.</w:t>
       </w:r>
     </w:p>
     <w:p>
@@ -10139,7 +10139,7 @@
           <w:i w:val="0"/>
           <w:sz w:val="21"/>
         </w:rPr>
-        <w:t xml:space="preserve"> to direct each record to the correct Iceberg table, enabling a single Firehose stream to perform inserts, updates, and deletes across multiple destination tables.</w:t>
+        <w:t xml:space="preserve"> to direct each record to the correct Iceberg table, so a single Firehose stream can perform inserts, updates, and deletes across multiple destination tables.</w:t>
       </w:r>
     </w:p>
     <w:p>
@@ -10222,7 +10222,7 @@
           <w:i w:val="0"/>
           <w:sz w:val="21"/>
         </w:rPr>
-        <w:t>Governed access</w:t>
+        <w:t>Governed access. You can use Lake Formation to control access to the Iceberg tables with fine-grained permissions for downstream consumers.</w:t>
       </w:r>
       <w:r>
         <w:rPr>
@@ -10231,7 +10231,6 @@
           <w:i w:val="0"/>
           <w:sz w:val="21"/>
         </w:rPr>
-        <w:t xml:space="preserve"> - Lake Formation provides centralized access control over the Iceberg tables, enabling fine-grained permissions for downstream consumers.</w:t>
       </w:r>
     </w:p>
     <w:p>
@@ -10254,7 +10253,7 @@
           <w:i w:val="0"/>
           <w:sz w:val="21"/>
         </w:rPr>
-        <w:t xml:space="preserve"> - Data from multiple isolated Aurora clusters can be unified in a single S3 Tables namespace, enabling joins and analytics across datasets that were previously siloed.</w:t>
+        <w:t xml:space="preserve"> - Data from multiple isolated Aurora clusters can be unified in a single S3 Tables namespace, letting you join and analyze datasets that were previously siloed.</w:t>
       </w:r>
     </w:p>
     <w:p>

</xml_diff>